<commit_message>
docs(reports): update student title page to Artem Kyrychenko, group FeP-31, and Variant 4 across all labs
</commit_message>
<xml_diff>
--- a/Lab_01/Звіт_Лабораторна_робота_1_Варіант_4.docx
+++ b/Lab_01/Звіт_Лабораторна_робота_1_Варіант_4.docx
@@ -25,12 +25,9 @@
         <w:jc w:val="right"/>
       </w:pPr>
       <w:r>
+        <w:t>Виконав: студент групи ФеП-31 Кириченко Артем</w:t>
         <w:br/>
-        <w:t>Виконав(ла): __________________________</w:t>
-        <w:br/>
-        <w:t>Група: _______________________________</w:t>
-        <w:br/>
-        <w:t>Перевірив(ла): ________________________</w:t>
+        <w:t>Перевірив: Свелеба Сергій Андрійович</w:t>
       </w:r>
     </w:p>
     <w:p>

</xml_diff>